<commit_message>
panduck: titulos en Times New Roman y sin azul en el reference docx de paper
En word/theme/theme1.xml la majorFont (headings) pasa de Calibri a Times New
Roman, igual que la minorFont del cuerpo, y en word/styles.xml los estilos
Title, Heading1-Heading9, AbstractTitle y TOCHeading pierden el azul del
reference por defecto de pandoc (quedan en negro, heredado de Normal). El
estilo Hyperlink conserva su color y el interlineado 1.5 del docDefaults no
cambia.
</commit_message>
<xml_diff>
--- a/src/panduck/data/reference/paper-reference.docx
+++ b/src/panduck/data/reference/paper-reference.docx
@@ -600,7 +600,6 @@
       <w:rFonts w:asciiTheme="majorHAnsi" w:eastAsiaTheme="majorEastAsia" w:hAnsiTheme="majorHAnsi" w:cstheme="majorBidi"/>
       <w:b/>
       <w:bCs/>
-      <w:color w:val="345A8A" w:themeColor="accent1" w:themeShade="B5"/>
       <w:sz w:val="36"/>
       <w:szCs w:val="36"/>
     </w:rPr>
@@ -656,7 +655,6 @@
       <w:sz w:val="20"/>
       <w:szCs w:val="20"/>
       <w:b/>
-      <w:color w:val="345A8A"/>
       &gt;
     </w:rPr>
   </w:style>
@@ -699,7 +697,6 @@
       <w:rFonts w:asciiTheme="majorHAnsi" w:eastAsiaTheme="majorEastAsia" w:hAnsiTheme="majorHAnsi" w:cstheme="majorBidi"/>
       <w:b/>
       <w:bCs/>
-      <w:color w:val="4F81BD" w:themeColor="accent1"/>
       <w:sz w:val="32"/>
       <w:szCs w:val="32"/>
     </w:rPr>
@@ -721,7 +718,6 @@
       <w:rFonts w:asciiTheme="majorHAnsi" w:eastAsiaTheme="majorEastAsia" w:hAnsiTheme="majorHAnsi" w:cstheme="majorBidi"/>
       <w:b/>
       <w:bCs/>
-      <w:color w:val="4F81BD" w:themeColor="accent1"/>
       <w:sz w:val="28"/>
       <w:szCs w:val="28"/>
     </w:rPr>
@@ -743,7 +739,6 @@
       <w:rFonts w:asciiTheme="majorHAnsi" w:eastAsiaTheme="majorEastAsia" w:hAnsiTheme="majorHAnsi" w:cstheme="majorBidi"/>
       <w:b/>
       <w:bCs/>
-      <w:color w:val="4F81BD" w:themeColor="accent1"/>
       <w:sz w:val="24"/>
       <w:szCs w:val="24"/>
     </w:rPr>
@@ -765,7 +760,6 @@
       <w:rFonts w:asciiTheme="majorHAnsi" w:eastAsiaTheme="majorEastAsia" w:hAnsiTheme="majorHAnsi" w:cstheme="majorBidi"/>
       <w:i/>
       <w:bCs/>
-      <w:color w:val="4F81BD" w:themeColor="accent1"/>
       <w:sz w:val="24"/>
       <w:szCs w:val="24"/>
     </w:rPr>
@@ -786,7 +780,6 @@
     <w:rPr>
       <w:rFonts w:asciiTheme="majorHAnsi" w:eastAsiaTheme="majorEastAsia" w:hAnsiTheme="majorHAnsi" w:cstheme="majorBidi"/>
       <w:iCs/>
-      <w:color w:val="4F81BD" w:themeColor="accent1"/>
       <w:sz w:val="24"/>
       <w:szCs w:val="24"/>
     </w:rPr>
@@ -806,7 +799,6 @@
     </w:pPr>
     <w:rPr>
       <w:rFonts w:asciiTheme="majorHAnsi" w:eastAsiaTheme="majorEastAsia" w:hAnsiTheme="majorHAnsi" w:cstheme="majorBidi"/>
-      <w:color w:val="4F81BD" w:themeColor="accent1"/>
       <w:sz w:val="24"/>
       <w:szCs w:val="24"/>
     </w:rPr>
@@ -826,7 +818,6 @@
     </w:pPr>
     <w:rPr>
       <w:rFonts w:asciiTheme="majorHAnsi" w:eastAsiaTheme="majorEastAsia" w:hAnsiTheme="majorHAnsi" w:cstheme="majorBidi"/>
-      <w:color w:val="4F81BD" w:themeColor="accent1"/>
       <w:sz w:val="24"/>
       <w:szCs w:val="24"/>
     </w:rPr>
@@ -846,7 +837,6 @@
     </w:pPr>
     <w:rPr>
       <w:rFonts w:asciiTheme="majorHAnsi" w:eastAsiaTheme="majorEastAsia" w:hAnsiTheme="majorHAnsi" w:cstheme="majorBidi"/>
-      <w:color w:val="4F81BD" w:themeColor="accent1"/>
       <w:sz w:val="24"/>
       <w:szCs w:val="24"/>
     </w:rPr>
@@ -866,7 +856,6 @@
     </w:pPr>
     <w:rPr>
       <w:rFonts w:asciiTheme="majorHAnsi" w:eastAsiaTheme="majorEastAsia" w:hAnsiTheme="majorHAnsi" w:cstheme="majorBidi"/>
-      <w:color w:val="4F81BD" w:themeColor="accent1"/>
       <w:sz w:val="24"/>
       <w:szCs w:val="24"/>
     </w:rPr>
@@ -1023,7 +1012,6 @@
       <w:rFonts w:asciiTheme="majorHAnsi" w:eastAsiaTheme="majorEastAsia" w:hAnsiTheme="majorHAnsi" w:cstheme="majorBidi"/>
       <w:b w:val="0"/>
       <w:bCs w:val="0"/>
-      <w:color w:val="365F91" w:themeColor="accent1" w:themeShade="BF"/>
     </w:rPr>
   </w:style>
 </w:styles>
@@ -1072,7 +1060,7 @@
     </a:clrScheme>
     <a:fontScheme name="Office">
       <a:majorFont>
-        <a:latin typeface="Calibri"/>
+        <a:latin typeface="Times New Roman"/>
         <a:ea typeface=""/>
         <a:cs typeface=""/>
         <a:font script="Jpan" typeface="ＭＳ ゴシック"/>

</xml_diff>